<commit_message>
Stage 8 fixes: HO-013
</commit_message>
<xml_diff>
--- a/output/archive/Tarnovell_Group/Integration/LIMS/2026/LIMS_Consolidation_Plan_DRAFT_v3.docx
+++ b/output/archive/Tarnovell_Group/Integration/LIMS/2026/LIMS_Consolidation_Plan_DRAFT_v3.docx
@@ -637,13 +637,13 @@
         </w:rPr>
         <w:t xml:space="preserve">Firm G is outside the export until the acquisition completes and its archive has been through access and QA mapping. </w:t>
       </w:r>
-      <w:del w:id="460" w:author="Yasmin Farhat" w:date="2026-09-14T09:00:00Z">
+      <w:del w:id="17357" w:author="Yasmin Farhat" w:date="2026-09-14T09:00:00Z">
         <w:r>
           <w:rPr>
             <w:i/>
             <w:sz w:val="18"/>
           </w:rPr>
-          <w:delText xml:space="preserve">Nothing in this draft assumes G's accession scheme</w:delText>
+          <w:delText xml:space="preserve">Nothing in this draft assumes G's accession scheme, and </w:delText>
         </w:r>
       </w:del>
       <w:r>
@@ -651,7 +651,7 @@
           <w:i/>
           <w:sz w:val="18"/>
         </w:rPr>
-        <w:t xml:space="preserve">, and the row above stays [TBC] until its LIMS owner has been named.</w:t>
+        <w:t xml:space="preserve">The row above stays [TBC] until its LIMS owner has been named.</w:t>
       </w:r>
     </w:p>
     <w:p>
@@ -704,7 +704,7 @@
         <w:keepLines/>
       </w:pPr>
       <w:r>
-        <w:t>Dosing route and date fields: ISO 8601 in the export, local display format unchanged in the source.</w:t>
+        <w:t>Dosing route: agreed controlled vocabulary. Date fields: ISO 8601 in the export, with local display formats unchanged in the source.</w:t>
       </w:r>
     </w:p>
     <w:p>
@@ -1224,7 +1224,7 @@
 
 <file path=word/comments.xml><?xml version="1.0" encoding="utf-8"?>
 <w:comments xmlns:a="http://schemas.openxmlformats.org/drawingml/2006/main" xmlns:pic="http://schemas.openxmlformats.org/drawingml/2006/picture" xmlns:r="http://schemas.openxmlformats.org/officeDocument/2006/relationships" xmlns:w="http://schemas.openxmlformats.org/wordprocessingml/2006/main" xmlns:wp="http://schemas.openxmlformats.org/drawingml/2006/wordprocessingDrawing" xmlns:mc="http://schemas.openxmlformats.org/markup-compatibility/2006" xmlns:a14="http://schemas.microsoft.com/office/drawing/2010/main" xmlns:w14="http://schemas.microsoft.com/office/word/2010/wordml" xmlns:wpc="http://schemas.microsoft.com/office/word/2010/wordprocessingCanvas">
-  <w:comment w:id="0" w:author="Yasmin Farhat" w:initials="YF" w:date="2026-10-08T15:05:27Z">
+  <w:comment w:id="0" w:author="Yasmin Farhat" w:initials="YF" w:date="2026-10-08T15:26:15Z">
     <w:p>
       <w:pPr>
         <w:pStyle w:val="CommentText"/>
@@ -1240,7 +1240,7 @@
       </w:r>
     </w:p>
   </w:comment>
-  <w:comment w:id="1" w:author="Yasmin Farhat" w:initials="YF" w:date="2026-10-08T15:05:27Z">
+  <w:comment w:id="1" w:author="Yasmin Farhat" w:initials="YF" w:date="2026-10-08T15:26:15Z">
     <w:p>
       <w:pPr>
         <w:pStyle w:val="CommentText"/>

</xml_diff>